<commit_message>
Update Academic Board Approval documents for AI Security Analyst and Agentic AI Coding courses
Co-Authored-By: Claude Opus 4.8 (1M context) <noreply@anthropic.com>
</commit_message>
<xml_diff>
--- a/01. Advanced Certificate in AI Security Analyst/Academic Board Approval - Advanced Certificate in AI Security Analyst.docx
+++ b/01. Advanced Certificate in AI Security Analyst/Academic Board Approval - Advanced Certificate in AI Security Analyst.docx
@@ -705,7 +705,15 @@
         <w:spacing w:before="160"/>
       </w:pPr>
       <w:r>
-        <w:t>The Academic Board confirms that the above teacher deployment is based on the teacher's relevant academic qualifications and professional experience, and is approved for the course stated in this document.</w:t>
+        <w:t xml:space="preserve">The Academic Board confirms that the above teacher deployment is based on the teacher's relevant academic qualifications and professional </w:t>
+      </w:r>
+      <w:proofErr w:type="gramStart"/>
+      <w:r>
+        <w:t>experience, and</w:t>
+      </w:r>
+      <w:proofErr w:type="gramEnd"/>
+      <w:r>
+        <w:t xml:space="preserve"> is approved for the course stated in this document.</w:t>
       </w:r>
     </w:p>
     <w:p>
@@ -722,7 +730,15 @@
         <w:ind w:left="360" w:hanging="216"/>
       </w:pPr>
       <w:r>
-        <w:t>- SSG ERF Registration Requirements require PEIs to establish an Academic Board to develop, implement and review policies and procedures governing academic quality and rigour.</w:t>
+        <w:t xml:space="preserve">- SSG ERF Registration Requirements require PEIs to establish an Academic Board to develop, implement and review policies and procedures governing academic quality and </w:t>
+      </w:r>
+      <w:proofErr w:type="spellStart"/>
+      <w:r>
+        <w:t>rigour</w:t>
+      </w:r>
+      <w:proofErr w:type="spellEnd"/>
+      <w:r>
+        <w:t>.</w:t>
       </w:r>
     </w:p>
     <w:p>
@@ -738,7 +754,15 @@
         <w:ind w:left="360" w:hanging="216"/>
       </w:pPr>
       <w:r>
-        <w:t>- The SSG Course Write-up for Courses Other than External Degree Programmes includes declarations that the course has been approved by the Academic Board and that the Academic Board has approved teacher deployment for the course.</w:t>
+        <w:t xml:space="preserve">- The SSG Course Write-up for Courses Other than External Degree </w:t>
+      </w:r>
+      <w:proofErr w:type="spellStart"/>
+      <w:r>
+        <w:t>Programmes</w:t>
+      </w:r>
+      <w:proofErr w:type="spellEnd"/>
+      <w:r>
+        <w:t xml:space="preserve"> includes declarations that the course has been approved by the Academic Board and that the Academic Board has approved teacher deployment for the course.</w:t>
       </w:r>
     </w:p>
     <w:p>
@@ -754,7 +778,23 @@
         <w:spacing w:after="160"/>
       </w:pPr>
       <w:r>
-        <w:t>This document is prepared as an Academic Board approval record for submission/supporting-document purposes. It should be signed by authorised Academic Board member(s) before submission to SSG, where a signed record is required.</w:t>
+        <w:t xml:space="preserve">This document is prepared as an Academic Board approval record for submission/supporting-document purposes. It should be signed by </w:t>
+      </w:r>
+      <w:proofErr w:type="spellStart"/>
+      <w:r>
+        <w:t>authorised</w:t>
+      </w:r>
+      <w:proofErr w:type="spellEnd"/>
+      <w:r>
+        <w:t xml:space="preserve"> Academic Board </w:t>
+      </w:r>
+      <w:proofErr w:type="gramStart"/>
+      <w:r>
+        <w:t>member</w:t>
+      </w:r>
+      <w:proofErr w:type="gramEnd"/>
+      <w:r>
+        <w:t>(s) before submission to SSG, where a signed record is required.</w:t>
       </w:r>
     </w:p>
     <w:tbl>
@@ -776,6 +816,11 @@
             <w:tcW w:w="3264" w:type="dxa"/>
           </w:tcPr>
           <w:p>
+            <w:pPr>
+              <w:rPr>
+                <w:sz w:val="19"/>
+              </w:rPr>
+            </w:pPr>
             <w:r>
               <w:rPr>
                 <w:sz w:val="19"/>
@@ -785,11 +830,67 @@
           </w:p>
           <w:p/>
           <w:p>
+            <w:pPr>
+              <w:jc w:val="center"/>
+            </w:pPr>
+            <w:r>
+              <w:rPr>
+                <w:noProof/>
+              </w:rPr>
+              <w:drawing>
+                <wp:inline distT="0" distB="0" distL="0" distR="0" wp14:anchorId="5459C882" wp14:editId="33E0151C">
+                  <wp:extent cx="1171575" cy="371475"/>
+                  <wp:effectExtent l="0" t="0" r="9525" b="9525"/>
+                  <wp:docPr id="112655851" name="Picture 2"/>
+                  <wp:cNvGraphicFramePr>
+                    <a:graphicFrameLocks xmlns:a="http://schemas.openxmlformats.org/drawingml/2006/main" noChangeAspect="1"/>
+                  </wp:cNvGraphicFramePr>
+                  <a:graphic xmlns:a="http://schemas.openxmlformats.org/drawingml/2006/main">
+                    <a:graphicData uri="http://schemas.openxmlformats.org/drawingml/2006/picture">
+                      <pic:pic xmlns:pic="http://schemas.openxmlformats.org/drawingml/2006/picture">
+                        <pic:nvPicPr>
+                          <pic:cNvPr id="0" name="Picture 6"/>
+                          <pic:cNvPicPr>
+                            <a:picLocks noChangeAspect="1" noChangeArrowheads="1"/>
+                          </pic:cNvPicPr>
+                        </pic:nvPicPr>
+                        <pic:blipFill>
+                          <a:blip r:embed="rId8">
+                            <a:extLst>
+                              <a:ext uri="{28A0092B-C50C-407E-A947-70E740481C1C}">
+                                <a14:useLocalDpi xmlns:a14="http://schemas.microsoft.com/office/drawing/2010/main" val="0"/>
+                              </a:ext>
+                            </a:extLst>
+                          </a:blip>
+                          <a:srcRect/>
+                          <a:stretch>
+                            <a:fillRect/>
+                          </a:stretch>
+                        </pic:blipFill>
+                        <pic:spPr bwMode="auto">
+                          <a:xfrm>
+                            <a:off x="0" y="0"/>
+                            <a:ext cx="1171575" cy="371475"/>
+                          </a:xfrm>
+                          <a:prstGeom prst="rect">
+                            <a:avLst/>
+                          </a:prstGeom>
+                          <a:noFill/>
+                          <a:ln>
+                            <a:noFill/>
+                          </a:ln>
+                        </pic:spPr>
+                      </pic:pic>
+                    </a:graphicData>
+                  </a:graphic>
+                </wp:inline>
+              </w:drawing>
+            </w:r>
             <w:r>
               <w:rPr>
                 <w:sz w:val="19"/>
               </w:rPr>
-              <w:t>_________________________</w:t>
+              <w:t>_________________</w:t>
             </w:r>
           </w:p>
           <w:p>
@@ -821,7 +922,7 @@
     </w:tbl>
     <w:p/>
     <w:sectPr>
-      <w:footerReference w:type="default" r:id="rId8"/>
+      <w:footerReference w:type="default" r:id="rId9"/>
       <w:pgSz w:w="12240" w:h="15840"/>
       <w:pgMar w:top="1008" w:right="1224" w:bottom="1008" w:left="1224" w:header="720" w:footer="720" w:gutter="0"/>
       <w:cols w:space="720"/>

</xml_diff>